<commit_message>
fix: enforce strict Cambridge IPA rules and natural sentences in aiGenerator
</commit_message>
<xml_diff>
--- a/Link vào app.docx
+++ b/Link vào app.docx
@@ -8,15 +8,13 @@
           <w:rPr>
             <w:rStyle w:val="Hyperlink"/>
           </w:rPr>
-          <w:t>https://vibe-speak-ihg811urc-ic-dalat.vercel.app/</w:t>
+          <w:t>vibespeak-cyber-arena</w:t>
         </w:r>
       </w:hyperlink>
-    </w:p>
-    <w:p/>
-    <w:p>
       <w:bookmarkStart w:id="0" w:name="_GoBack"/>
       <w:bookmarkEnd w:id="0"/>
     </w:p>
+    <w:p/>
     <w:sectPr>
       <w:pgSz w:w="12240" w:h="15840"/>
       <w:pgMar w:top="1440" w:right="1440" w:bottom="1440" w:left="1440" w:header="720" w:footer="720" w:gutter="0"/>

</xml_diff>